<commit_message>
fix: prevent template double-binding blank shifting into section 2 and enforce 1:1 checkbox aspect ratio
</commit_message>
<xml_diff>
--- a/backend/data/templates/aaad2dd6-9332-4f83-883e-8dd6f6c0d61c.docx
+++ b/backend/data/templates/aaad2dd6-9332-4f83-883e-8dd6f6c0d61c.docx
@@ -729,14 +729,7 @@
         </w:rPr>
       </w:pPr>
       <w:r>
-        <w:rPr>
-          <w:rFonts w:ascii="Times New Roman" w:eastAsia="Calibri" w:hAnsi="Times New Roman"/>
-          <w:iCs/>
-          <w:sz w:val="26"/>
-          <w:szCs w:val="26"/>
-          <w:lang w:val="vi-VN"/>
-        </w:rPr>
-        <w:t>{{ field_9009 }}</w:t>
+        <w:tab/>
       </w:r>
     </w:p>
     <w:p>

</xml_diff>